<commit_message>
Docs: correct column meanings in dim_date, dim_company and the fact keys
</commit_message>
<xml_diff>
--- a/docs/03_Physical_Model.docx
+++ b/docs/03_Physical_Model.docx
@@ -763,7 +763,7 @@
               <w:pStyle w:val="Compact"/>
             </w:pPr>
             <w:r>
-              <w:t xml:space="preserve">Day as a number YYYYMMDD; points to dim_date</w:t>
+              <w:t xml:space="preserve">The day as a number YYYYMMDD, for example 20261022</w:t>
             </w:r>
           </w:p>
         </w:tc>
@@ -925,7 +925,7 @@
               <w:pStyle w:val="Compact"/>
             </w:pPr>
             <w:r>
-              <w:t xml:space="preserve">First day of the month</w:t>
+              <w:t xml:space="preserve">Month number (1-12)</w:t>
             </w:r>
           </w:p>
         </w:tc>
@@ -1631,7 +1631,7 @@
               <w:pStyle w:val="Compact"/>
             </w:pPr>
             <w:r>
-              <w:t xml:space="preserve">Two-letter country code ('XX' = unknown)</w:t>
+              <w:t xml:space="preserve">Country where the company is registered</w:t>
             </w:r>
           </w:p>
         </w:tc>
@@ -2877,7 +2877,7 @@
               <w:pStyle w:val="Compact"/>
             </w:pPr>
             <w:r>
-              <w:t xml:space="preserve">Source company id</w:t>
+              <w:t xml:space="preserve">Source id of the company that serves this person</w:t>
             </w:r>
           </w:p>
         </w:tc>
@@ -3589,7 +3589,7 @@
               <w:pStyle w:val="Compact"/>
             </w:pPr>
             <w:r>
-              <w:t xml:space="preserve">Warehouse key of one company version (surrogate key)</w:t>
+              <w:t xml:space="preserve">The company version valid on the order day (points to dim_company)</w:t>
             </w:r>
           </w:p>
         </w:tc>
@@ -3643,7 +3643,7 @@
               <w:pStyle w:val="Compact"/>
             </w:pPr>
             <w:r>
-              <w:t xml:space="preserve">Warehouse key of one end-customer version (surrogate key)</w:t>
+              <w:t xml:space="preserve">The end-customer version valid on the order day (points to dim_end_customer)</w:t>
             </w:r>
           </w:p>
         </w:tc>
@@ -3697,7 +3697,7 @@
               <w:pStyle w:val="Compact"/>
             </w:pPr>
             <w:r>
-              <w:t xml:space="preserve">Warehouse key of one product version (surrogate key)</w:t>
+              <w:t xml:space="preserve">The product version valid on the order day (points to dim_product)</w:t>
             </w:r>
           </w:p>
         </w:tc>
@@ -4188,7 +4188,7 @@
               <w:pStyle w:val="Compact"/>
             </w:pPr>
             <w:r>
-              <w:t xml:space="preserve">Warehouse key of one company version (surrogate key)</w:t>
+              <w:t xml:space="preserve">The company version valid on the login day (points to dim_company)</w:t>
             </w:r>
           </w:p>
         </w:tc>
@@ -4242,7 +4242,7 @@
               <w:pStyle w:val="Compact"/>
             </w:pPr>
             <w:r>
-              <w:t xml:space="preserve">Warehouse key of a device kind</w:t>
+              <w:t xml:space="preserve">The device of the visit (points to dim_device)</w:t>
             </w:r>
           </w:p>
         </w:tc>
@@ -4296,7 +4296,7 @@
               <w:pStyle w:val="Compact"/>
             </w:pPr>
             <w:r>
-              <w:t xml:space="preserve">Two-letter country code ('XX' = unknown)</w:t>
+              <w:t xml:space="preserve">Country of the visitor's IP address ('XX' = not in the lookup file); points to dim_country</w:t>
             </w:r>
           </w:p>
         </w:tc>

</xml_diff>

<commit_message>
Docs: fix review findings and explain the country outrigger
</commit_message>
<xml_diff>
--- a/docs/03_Physical_Model.docx
+++ b/docs/03_Physical_Model.docx
@@ -298,7 +298,7 @@
               <w:pStyle w:val="Compact"/>
             </w:pPr>
             <w:r>
-              <w:t xml:space="preserve">Emptied and copied again on a full run. An incremental run only brings in what changed in orders, order lines and the log</w:t>
+              <w:t xml:space="preserve">Emptied and copied again on a full run. An incremental run brings in only what changed in orders, order lines and the log; the other raw tables are copied in full</w:t>
             </w:r>
           </w:p>
         </w:tc>
@@ -390,7 +390,7 @@
               <w:pStyle w:val="Compact"/>
             </w:pPr>
             <w:r>
-              <w:t xml:space="preserve">Rebuilt on every run, except the 3 history tables, which are only added to</w:t>
+              <w:t xml:space="preserve">Rebuilt on every run, except the 3 history tables, which are never emptied: a changed row is closed and a new version is added</w:t>
             </w:r>
           </w:p>
         </w:tc>
@@ -1631,7 +1631,7 @@
               <w:pStyle w:val="Compact"/>
             </w:pPr>
             <w:r>
-              <w:t xml:space="preserve">Country where the company is registered</w:t>
+              <w:t xml:space="preserve">Country where the company is registered; points to dim_country</w:t>
             </w:r>
           </w:p>
         </w:tc>
@@ -4327,7 +4327,7 @@
         <w:pStyle w:val="FirstParagraph"/>
       </w:pPr>
       <w:r>
-        <w:t xml:space="preserve">Each source table has a raw table, and most have a staging table. This shows how many rows each one holds in a fresh build:</w:t>
+        <w:t xml:space="preserve">Each source table has a raw table, except b2b.changes, which the incremental load reads straight from the source. Most have a staging table. This shows how many rows each one holds in a fresh build:</w:t>
       </w:r>
     </w:p>
     <w:tbl>
@@ -5723,7 +5723,7 @@
         <w:pStyle w:val="FirstParagraph"/>
       </w:pPr>
       <w:r>
-        <w:t xml:space="preserve">Every dw table has a primary key, and the database makes sure it is unique. In the two facts the key is the grain: order_id + line_number in fact_sales, username + login_time in fact_logins. The links between facts and dimensions are checked by a test instead of foreign keys (see 02 Logical Model, section 5). One index was added by hand: on date_key in both fact tables, because reports often filter by date.</w:t>
+        <w:t xml:space="preserve">Every dw table has a primary key, and the database makes sure it is unique. In the two facts the key is the grain: order_id + line_number in fact_sales, username + login_time in fact_logins. The links between facts and dimensions are checked by a test instead of foreign keys (see 02 Logical Model, section 5). Two indexes were added by hand: one on date_key in each fact table, because reports often filter by date.</w:t>
       </w:r>
     </w:p>
     <w:bookmarkEnd w:id="26"/>

</xml_diff>